<commit_message>
QED Course: checkpoint the uncommitted 1 Oct evening rebuild (lessons, prologues, Mead) and the Classical Optics interlude draft before restructuring
</commit_message>
<xml_diff>
--- a/QED Course/Lesson 01 Complex Numbers and Linear Algebra.docx
+++ b/QED Course/Lesson 01 Complex Numbers and Linear Algebra.docx
@@ -58,7 +58,7 @@
     </w:p>
     <w:p>
       <w:pPr>
-        <w:pStyle w:val="Heading1"/>
+        <w:pStyle w:val="Heading2"/>
       </w:pPr>
       <w:r>
         <w:t>How to use this lesson</w:t>
@@ -76,7 +76,7 @@
     </w:p>
     <w:p>
       <w:pPr>
-        <w:pStyle w:val="Heading2"/>
+        <w:pStyle w:val="Heading3"/>
       </w:pPr>
       <w:r>
         <w:t>Learning objectives</w:t>
@@ -148,7 +148,7 @@
     </w:p>
     <w:p>
       <w:pPr>
-        <w:pStyle w:val="Heading2"/>
+        <w:pStyle w:val="Heading3"/>
       </w:pPr>
       <w:r>
         <w:t>Notation and conventions</w:t>
@@ -477,7 +477,7 @@
     </w:p>
     <w:p>
       <w:pPr>
-        <w:pStyle w:val="Heading1"/>
+        <w:pStyle w:val="Heading2"/>
       </w:pPr>
       <w:r>
         <w:t>1 Complex numbers</w:t>
@@ -485,7 +485,7 @@
     </w:p>
     <w:p>
       <w:pPr>
-        <w:pStyle w:val="Heading2"/>
+        <w:pStyle w:val="Heading3"/>
       </w:pPr>
       <w:r>
         <w:t>1.1 Why quantum theory uses complex numbers</w:t>
@@ -498,7 +498,7 @@
     </w:p>
     <w:p>
       <w:pPr>
-        <w:pStyle w:val="Heading2"/>
+        <w:pStyle w:val="Heading3"/>
       </w:pPr>
       <w:r>
         <w:t>1.2 Cartesian form</w:t>
@@ -541,10 +541,11 @@
       </m:oMathPara>
     </w:p>
     <w:p>
-      <w:pPr>
-        <w:pStyle w:val="Heading3"/>
-      </w:pPr>
       <w:r>
+        <w:rPr>
+          <w:b/>
+          <w:i/>
+        </w:rPr>
         <w:t>Worked example 1</w:t>
       </w:r>
     </w:p>
@@ -573,7 +574,7 @@
     </w:p>
     <w:p>
       <w:pPr>
-        <w:pStyle w:val="Heading2"/>
+        <w:pStyle w:val="Heading3"/>
       </w:pPr>
       <w:r>
         <w:t>1.3 Conjugation and modulus</w:t>
@@ -630,10 +631,11 @@
       </w:r>
     </w:p>
     <w:p>
-      <w:pPr>
-        <w:pStyle w:val="Heading3"/>
-      </w:pPr>
       <w:r>
+        <w:rPr>
+          <w:b/>
+          <w:i/>
+        </w:rPr>
         <w:t>Worked example 2</w:t>
       </w:r>
     </w:p>
@@ -662,7 +664,7 @@
     </w:p>
     <w:p>
       <w:pPr>
-        <w:pStyle w:val="Heading2"/>
+        <w:pStyle w:val="Heading3"/>
       </w:pPr>
       <w:r>
         <w:t>1.4 Polar form and Euler formula</w:t>
@@ -700,10 +702,11 @@
       </m:oMathPara>
     </w:p>
     <w:p>
-      <w:pPr>
-        <w:pStyle w:val="Heading3"/>
-      </w:pPr>
       <w:r>
+        <w:rPr>
+          <w:b/>
+          <w:i/>
+        </w:rPr>
         <w:t>Worked example 3</w:t>
       </w:r>
     </w:p>
@@ -714,7 +717,7 @@
     </w:p>
     <w:p>
       <w:pPr>
-        <w:pStyle w:val="Heading2"/>
+        <w:pStyle w:val="Heading3"/>
       </w:pPr>
       <w:r>
         <w:t>1.5 Phase and interference</w:t>
@@ -745,7 +748,7 @@
     </w:p>
     <w:p>
       <w:pPr>
-        <w:pStyle w:val="Heading1"/>
+        <w:pStyle w:val="Heading2"/>
       </w:pPr>
       <w:r>
         <w:t>2 Vectors and vector spaces</w:t>
@@ -753,7 +756,7 @@
     </w:p>
     <w:p>
       <w:pPr>
-        <w:pStyle w:val="Heading2"/>
+        <w:pStyle w:val="Heading3"/>
       </w:pPr>
       <w:r>
         <w:t>2.1 Abstract vectors</w:t>
@@ -766,7 +769,7 @@
     </w:p>
     <w:p>
       <w:pPr>
-        <w:pStyle w:val="Heading2"/>
+        <w:pStyle w:val="Heading3"/>
       </w:pPr>
       <w:r>
         <w:t>2.2 Coordinates and bases</w:t>
@@ -797,7 +800,7 @@
     </w:p>
     <w:p>
       <w:pPr>
-        <w:pStyle w:val="Heading2"/>
+        <w:pStyle w:val="Heading3"/>
       </w:pPr>
       <w:r>
         <w:t>2.3 Linear independence span and dimension</w:t>
@@ -836,10 +839,11 @@
       </w:r>
     </w:p>
     <w:p>
-      <w:pPr>
-        <w:pStyle w:val="Heading3"/>
-      </w:pPr>
       <w:r>
+        <w:rPr>
+          <w:b/>
+          <w:i/>
+        </w:rPr>
         <w:t>Worked example 4</w:t>
       </w:r>
     </w:p>
@@ -850,7 +854,7 @@
     </w:p>
     <w:p>
       <w:pPr>
-        <w:pStyle w:val="Heading1"/>
+        <w:pStyle w:val="Heading2"/>
       </w:pPr>
       <w:r>
         <w:t>3 Inner products and geometry</w:t>
@@ -858,7 +862,7 @@
     </w:p>
     <w:p>
       <w:pPr>
-        <w:pStyle w:val="Heading2"/>
+        <w:pStyle w:val="Heading3"/>
       </w:pPr>
       <w:r>
         <w:t>3.1 The complex inner product</w:t>
@@ -889,7 +893,7 @@
     </w:p>
     <w:p>
       <w:pPr>
-        <w:pStyle w:val="Heading2"/>
+        <w:pStyle w:val="Heading3"/>
       </w:pPr>
       <w:r>
         <w:t>3.2 Norm orthogonality and normalization</w:t>
@@ -914,10 +918,11 @@
       </w:r>
     </w:p>
     <w:p>
-      <w:pPr>
-        <w:pStyle w:val="Heading3"/>
-      </w:pPr>
       <w:r>
+        <w:rPr>
+          <w:b/>
+          <w:i/>
+        </w:rPr>
         <w:t>Worked example 5</w:t>
       </w:r>
     </w:p>
@@ -928,7 +933,7 @@
     </w:p>
     <w:p>
       <w:pPr>
-        <w:pStyle w:val="Heading2"/>
+        <w:pStyle w:val="Heading3"/>
       </w:pPr>
       <w:r>
         <w:t>3.3 Completeness in finite dimensions</w:t>
@@ -959,10 +964,10 @@
     </w:p>
     <w:p>
       <w:pPr>
-        <w:pStyle w:val="Heading2"/>
+        <w:pStyle w:val="Heading3"/>
       </w:pPr>
       <w:r>
-        <w:t>3.4 Gram Schmidt orthonormalization</w:t>
+        <w:t>3.4 Gram–Schmidt orthonormalization</w:t>
       </w:r>
     </w:p>
     <w:p>
@@ -985,7 +990,7 @@
     </w:p>
     <w:p>
       <w:pPr>
-        <w:pStyle w:val="Heading1"/>
+        <w:pStyle w:val="Heading2"/>
       </w:pPr>
       <w:r>
         <w:t>4 Linear operators and matrices</w:t>
@@ -993,7 +998,7 @@
     </w:p>
     <w:p>
       <w:pPr>
-        <w:pStyle w:val="Heading2"/>
+        <w:pStyle w:val="Heading3"/>
       </w:pPr>
       <w:r>
         <w:t>4.1 Linearity</w:t>
@@ -1006,7 +1011,7 @@
     </w:p>
     <w:p>
       <w:pPr>
-        <w:pStyle w:val="Heading2"/>
+        <w:pStyle w:val="Heading3"/>
       </w:pPr>
       <w:r>
         <w:t>4.2 Matrix action and composition</w:t>
@@ -1027,7 +1032,7 @@
     </w:p>
     <w:p>
       <w:pPr>
-        <w:pStyle w:val="Heading2"/>
+        <w:pStyle w:val="Heading3"/>
       </w:pPr>
       <w:r>
         <w:t>4.3 Identity inverse determinant and trace</w:t>
@@ -1264,7 +1269,7 @@
     </w:p>
     <w:p>
       <w:pPr>
-        <w:pStyle w:val="Heading2"/>
+        <w:pStyle w:val="Heading3"/>
       </w:pPr>
       <w:r>
         <w:t>4.4 Change of basis</w:t>
@@ -1295,7 +1300,7 @@
     </w:p>
     <w:p>
       <w:pPr>
-        <w:pStyle w:val="Heading1"/>
+        <w:pStyle w:val="Heading2"/>
       </w:pPr>
       <w:r>
         <w:t>5 Eigenvalues eigenvectors and diagonalization</w:t>
@@ -1303,7 +1308,7 @@
     </w:p>
     <w:p>
       <w:pPr>
-        <w:pStyle w:val="Heading2"/>
+        <w:pStyle w:val="Heading3"/>
       </w:pPr>
       <w:r>
         <w:t>5.1 The eigenvalue equation</w:t>
@@ -1328,10 +1333,11 @@
       </w:r>
     </w:p>
     <w:p>
-      <w:pPr>
-        <w:pStyle w:val="Heading3"/>
-      </w:pPr>
       <w:r>
+        <w:rPr>
+          <w:b/>
+          <w:i/>
+        </w:rPr>
         <w:t>Worked example 6</w:t>
       </w:r>
     </w:p>
@@ -1342,7 +1348,7 @@
     </w:p>
     <w:p>
       <w:pPr>
-        <w:pStyle w:val="Heading2"/>
+        <w:pStyle w:val="Heading3"/>
       </w:pPr>
       <w:r>
         <w:t>5.2 Diagonalization</w:t>
@@ -1368,7 +1374,7 @@
     </w:p>
     <w:p>
       <w:pPr>
-        <w:pStyle w:val="Heading2"/>
+        <w:pStyle w:val="Heading3"/>
       </w:pPr>
       <w:r>
         <w:t>5.3 Degeneracy and commuting operators</w:t>
@@ -1381,7 +1387,7 @@
     </w:p>
     <w:p>
       <w:pPr>
-        <w:pStyle w:val="Heading1"/>
+        <w:pStyle w:val="Heading2"/>
       </w:pPr>
       <w:r>
         <w:t>6 Adjoint Hermitian and unitary operators</w:t>
@@ -1389,7 +1395,7 @@
     </w:p>
     <w:p>
       <w:pPr>
-        <w:pStyle w:val="Heading2"/>
+        <w:pStyle w:val="Heading3"/>
       </w:pPr>
       <w:r>
         <w:t>6.1 The adjoint</w:t>
@@ -1426,7 +1432,7 @@
     </w:p>
     <w:p>
       <w:pPr>
-        <w:pStyle w:val="Heading2"/>
+        <w:pStyle w:val="Heading3"/>
       </w:pPr>
       <w:r>
         <w:t>6.2 Hermitian operators</w:t>
@@ -1452,7 +1458,7 @@
     </w:p>
     <w:p>
       <w:pPr>
-        <w:pStyle w:val="Heading2"/>
+        <w:pStyle w:val="Heading3"/>
       </w:pPr>
       <w:r>
         <w:t>6.3 Unitary operators</w:t>
@@ -1478,7 +1484,7 @@
     </w:p>
     <w:p>
       <w:pPr>
-        <w:pStyle w:val="Heading2"/>
+        <w:pStyle w:val="Heading3"/>
       </w:pPr>
       <w:r>
         <w:t>6.4 Projectors</w:t>
@@ -1504,15 +1510,15 @@
     </w:p>
     <w:p>
       <w:pPr>
-        <w:pStyle w:val="Heading1"/>
+        <w:pStyle w:val="Heading2"/>
       </w:pPr>
       <w:r>
-        <w:t>7 Bra ket notation</w:t>
+        <w:t>7 Bra-ket notation</w:t>
       </w:r>
     </w:p>
     <w:p>
       <w:pPr>
-        <w:pStyle w:val="Heading2"/>
+        <w:pStyle w:val="Heading3"/>
       </w:pPr>
       <w:r>
         <w:t>7.1 Kets and bras</w:t>
@@ -1538,7 +1544,7 @@
     </w:p>
     <w:p>
       <w:pPr>
-        <w:pStyle w:val="Heading2"/>
+        <w:pStyle w:val="Heading3"/>
       </w:pPr>
       <w:r>
         <w:t>7.2 Matrix elements</w:t>
@@ -1551,7 +1557,7 @@
     </w:p>
     <w:p>
       <w:pPr>
-        <w:pStyle w:val="Heading2"/>
+        <w:pStyle w:val="Heading3"/>
       </w:pPr>
       <w:r>
         <w:t>7.3 Expectation values</w:t>
@@ -1577,7 +1583,7 @@
     </w:p>
     <w:p>
       <w:pPr>
-        <w:pStyle w:val="Heading1"/>
+        <w:pStyle w:val="Heading2"/>
       </w:pPr>
       <w:r>
         <w:t>8 Pauli matrices as a preview of spin</w:t>
@@ -1620,10 +1626,11 @@
       </m:oMathPara>
     </w:p>
     <w:p>
-      <w:pPr>
-        <w:pStyle w:val="Heading3"/>
-      </w:pPr>
       <w:r>
+        <w:rPr>
+          <w:b/>
+          <w:i/>
+        </w:rPr>
         <w:t>Worked example 7</w:t>
       </w:r>
     </w:p>
@@ -1634,7 +1641,7 @@
     </w:p>
     <w:p>
       <w:pPr>
-        <w:pStyle w:val="Heading1"/>
+        <w:pStyle w:val="Heading2"/>
       </w:pPr>
       <w:r>
         <w:t>9 Connections to QED</w:t>
@@ -2006,7 +2013,7 @@
     </w:p>
     <w:p>
       <w:pPr>
-        <w:pStyle w:val="Heading1"/>
+        <w:pStyle w:val="Heading2"/>
       </w:pPr>
       <w:r>
         <w:t>10 Summary</w:t>
@@ -2078,7 +2085,7 @@
     </w:p>
     <w:p>
       <w:pPr>
-        <w:pStyle w:val="Heading1"/>
+        <w:pStyle w:val="Heading2"/>
       </w:pPr>
       <w:r>
         <w:t>Exercises</w:t>
@@ -2432,7 +2439,7 @@
           </w:tcPr>
           <w:p>
             <w:r>
-              <w:t>Apply Gram Schmidt to v₁=(1,1)ᵀ and v₂=(1,0)ᵀ.</w:t>
+              <w:t>Apply Gram–Schmidt to v₁=(1,1)ᵀ and v₂=(1,0)ᵀ.</w:t>
             </w:r>
           </w:p>
         </w:tc>
@@ -2746,7 +2753,7 @@
     </w:p>
     <w:p>
       <w:pPr>
-        <w:pStyle w:val="Heading1"/>
+        <w:pStyle w:val="Heading2"/>
       </w:pPr>
       <w:r>
         <w:t>Solutions</w:t>
@@ -2978,7 +2985,7 @@
     </w:p>
     <w:p>
       <w:pPr>
-        <w:pStyle w:val="Heading1"/>
+        <w:pStyle w:val="Heading2"/>
       </w:pPr>
       <w:r>
         <w:t>Mastery checklist</w:t>
@@ -3042,7 +3049,7 @@
     </w:p>
     <w:p>
       <w:pPr>
-        <w:pStyle w:val="Heading1"/>
+        <w:pStyle w:val="Heading2"/>
       </w:pPr>
       <w:r>
         <w:t>Next lesson</w:t>

</xml_diff>